<commit_message>
Absendenbuch: Deckblatt mit Ort und Datum des Absendens, ruhigerer Cup (1.68.13)
- Deckblatt: ${Deckblatt} = Ort und Datum des Absendens aus dem
  Jahresprogramm (absendenbuchDeckblatt: Anlass mit «Absenden», Datum
  aus JMSchiesstage, Ort aus der Adresse); Rueckfall Roggenacker bzw.
  Druckdatum. Logo «Grafik 4» umfliesst Text nur links, die Zeile
  zerfiel vorher um das Logo herum.
- Cup «wie heute, nur ruhiger»: Sieger fett, Ausgeschiedene grau statt
  durchgestrichen, feine einheitliche Linien statt gestrichelt/doppelt;
  Final und Standcup mit fettem Podest, ohne leere Abschlusszeile.
  Paarungen beachten ManualWinner wie inc/cup.php. Ungenutztes
  $cellStyle entfernt.

Getestet mit Prod-Kopie: 2026 «Pfaeffikon, 14. November 2026», 2025
«Roggenacker, 15. November 2025»; Cup-Text unveraendert, im XML 0
Durchstreichungen/gestrichelt/doppelt; Buecher wohlgeformt.

Co-Authored-By: Claude Opus 5.5 (1M context) <noreply@anthropic.com>
</commit_message>
<xml_diff>
--- a/inc/absenden/dat/Resultatbuch_Template20261013.docx
+++ b/inc/absenden/dat/Resultatbuch_Template20261013.docx
@@ -319,7 +319,7 @@
             </wp:positionV>
             <wp:extent cx="1440815" cy="1419225"/>
             <wp:effectExtent l="0" t="0" r="6985" b="9525"/>
-            <wp:wrapSquare wrapText="bothSides"/>
+            <wp:wrapSquare wrapText="left"/>
             <wp:docPr id="4" name="Grafik 4" descr="Standarte"/>
             <wp:cNvGraphicFramePr>
               <a:graphicFrameLocks xmlns:a="http://schemas.openxmlformats.org/drawingml/2006/main" noChangeAspect="1"/>
@@ -435,7 +435,7 @@
           <w:rFonts w:cs="Times New Roman"/>
           <w:i/>
         </w:rPr>
-        <w:t xml:space="preserve">Roggenacker </w:t>
+        <w:t xml:space="preserve">${Deckblatt}</w:t>
       </w:r>
       <w:r>
         <w:rPr>
@@ -443,7 +443,7 @@
           <w:i/>
         </w:rPr>
         <w:br/>
-        <w:t>${</w:t>
+        <w:t/>
       </w:r>
       <w:proofErr w:type="spellStart"/>
       <w:r>
@@ -451,7 +451,7 @@
           <w:rFonts w:cs="Times New Roman"/>
           <w:i/>
         </w:rPr>
-        <w:t>PrintDate</w:t>
+        <w:t/>
       </w:r>
       <w:proofErr w:type="spellEnd"/>
       <w:r>
@@ -459,7 +459,7 @@
           <w:rFonts w:cs="Times New Roman"/>
           <w:i/>
         </w:rPr>
-        <w:t>}</w:t>
+        <w:t/>
       </w:r>
     </w:p>
     <w:p>

</xml_diff>

<commit_message>
Absendenbuch: einheitliche Kategorienamen (1.68.14)
Vorlage: «Endschiessen Total Sieger Standardgewehr/Ordonnanzwaffen» ->
«Endschiessen Total Kat. A (Standardgewehr)» / «Kat. B (Ordonnanzwaffen)»;
Siegerlisten-Untertitel «Standardgewehr und freie Waffen» / «Karabiner
und Sturmgewehr 57/90» (je 3x) -> «Kat. A (Standardgewehr)» /
«Kat. B (Ordonnanzwaffen)».

Co-Authored-By: Claude Opus 5.5 (1M context) <noreply@anthropic.com>
</commit_message>
<xml_diff>
--- a/inc/absenden/dat/Resultatbuch_Template20261013.docx
+++ b/inc/absenden/dat/Resultatbuch_Template20261013.docx
@@ -6517,7 +6517,7 @@
           <w:szCs w:val="28"/>
         </w:rPr>
         <w:lastRenderedPageBreak/>
-        <w:t>Endschiessen Total Sieger Standardgewehr</w:t>
+        <w:t>Endschiessen Total Kat. A (Standardgewehr)</w:t>
       </w:r>
     </w:p>
     <w:tbl>
@@ -7184,7 +7184,7 @@
           <w:sz w:val="28"/>
           <w:szCs w:val="28"/>
         </w:rPr>
-        <w:t>Endschiessen Total Sieger Ordonnanzwaffen</w:t>
+        <w:t>Endschiessen Total Kat. B (Ordonnanzwaffen)</w:t>
       </w:r>
     </w:p>
     <w:tbl>
@@ -11104,7 +11104,7 @@
           <w:b/>
           <w:szCs w:val="18"/>
         </w:rPr>
-        <w:t>Standardgewehr und freie Waffen</w:t>
+        <w:t>Kat. A (Standardgewehr)</w:t>
       </w:r>
     </w:p>
     <w:tbl>
@@ -11583,7 +11583,7 @@
           <w:b/>
           <w:szCs w:val="18"/>
         </w:rPr>
-        <w:t>Karabiner und Sturmgewehr 57/90</w:t>
+        <w:t>Kat. B (Ordonnanzwaffen)</w:t>
       </w:r>
     </w:p>
     <w:tbl>
@@ -13628,7 +13628,7 @@
           <w:b/>
           <w:szCs w:val="18"/>
         </w:rPr>
-        <w:t>Standardgewehr und freie Waffen</w:t>
+        <w:t>Kat. A (Standardgewehr)</w:t>
       </w:r>
     </w:p>
     <w:tbl>
@@ -14177,7 +14177,7 @@
           <w:b/>
           <w:szCs w:val="18"/>
         </w:rPr>
-        <w:t>Karabiner und Sturmgewehr 57/90</w:t>
+        <w:t>Kat. B (Ordonnanzwaffen)</w:t>
       </w:r>
     </w:p>
     <w:tbl>
@@ -16177,7 +16177,7 @@
           <w:b/>
           <w:szCs w:val="18"/>
         </w:rPr>
-        <w:t>Standardgewehr und freie Waffen</w:t>
+        <w:t>Kat. A (Standardgewehr)</w:t>
       </w:r>
     </w:p>
     <w:tbl>
@@ -16656,7 +16656,7 @@
           <w:b/>
           <w:szCs w:val="18"/>
         </w:rPr>
-        <w:t>Karabiner und Sturmgewehr 57/90</w:t>
+        <w:t>Kat. B (Ordonnanzwaffen)</w:t>
       </w:r>
     </w:p>
     <w:tbl>

</xml_diff>

<commit_message>
Absendenbuch: Vereinscup uebersichtlicher (1.68.15)
Nach Word-Vorschau mit dem Benutzer:
- Vorlage: Ueberschrift «Vereinscup», Rundentitel ohne Doppelbalken,
  mit Abstand zwischen den Runden.
- Runden: Paarungen in Reihenfolge der Auslosung, ohne Rahmen; feine
  Linie unter jeder Begegnung (Dreiergruppe ohne Linie dazwischen),
  Sieger fett, Zeilen min. 320 Twips, linksbuendig, 7100 Twips.
- Final/Standcup: 3550 Twips, Punkte unter der ersten Punktespalte,
  ohne Rahmen, nur Sieger fett.
- JM unveraendert.

Co-Authored-By: Claude Opus 5.5 (1M context) <noreply@anthropic.com>
</commit_message>
<xml_diff>
--- a/inc/absenden/dat/Resultatbuch_Template20261013.docx
+++ b/inc/absenden/dat/Resultatbuch_Template20261013.docx
@@ -17134,10 +17134,29 @@
     </w:p>
     <w:p>
       <w:pPr>
-        <w:pBdr>
-          <w:top w:val="thinThickSmallGap" w:sz="24" w:space="1" w:color="auto"/>
-          <w:bottom w:val="thickThinSmallGap" w:sz="24" w:space="1" w:color="auto"/>
-        </w:pBdr>
+        <w:jc w:val="both"/>
+        <w:rPr>
+          <w:rFonts w:cs="Times New Roman"/>
+          <w:b/>
+          <w:bCs/>
+          <w:sz w:val="28"/>
+          <w:szCs w:val="28"/>
+        </w:rPr>
+      </w:pPr>
+      <w:r>
+        <w:rPr>
+          <w:rFonts w:cs="Times New Roman"/>
+          <w:b/>
+          <w:bCs/>
+          <w:sz w:val="28"/>
+          <w:szCs w:val="28"/>
+        </w:rPr>
+        <w:t>Vereinscup</w:t>
+      </w:r>
+    </w:p>
+    <w:p>
+      <w:pPr>
+        <w:spacing w:before="120" w:after="60"/>
         <w:jc w:val="center"/>
         <w:rPr>
           <w:rFonts w:cs="Times New Roman"/>
@@ -17174,11 +17193,7 @@
     </w:p>
     <w:p>
       <w:pPr>
-        <w:pBdr>
-          <w:top w:val="thinThickSmallGap" w:sz="24" w:space="1" w:color="auto"/>
-          <w:bottom w:val="thickThinSmallGap" w:sz="24" w:space="1" w:color="auto"/>
-        </w:pBdr>
-        <w:spacing w:before="120"/>
+        <w:spacing w:before="360" w:after="60"/>
         <w:jc w:val="center"/>
         <w:rPr>
           <w:rFonts w:cs="Times New Roman"/>
@@ -17214,11 +17229,7 @@
     </w:p>
     <w:p>
       <w:pPr>
-        <w:pBdr>
-          <w:top w:val="thinThickSmallGap" w:sz="24" w:space="1" w:color="auto"/>
-          <w:bottom w:val="thickThinSmallGap" w:sz="24" w:space="1" w:color="auto"/>
-        </w:pBdr>
-        <w:spacing w:before="120"/>
+        <w:spacing w:before="360" w:after="60"/>
         <w:jc w:val="center"/>
         <w:rPr>
           <w:rFonts w:cs="Times New Roman"/>
@@ -17254,11 +17265,7 @@
     </w:p>
     <w:p>
       <w:pPr>
-        <w:pBdr>
-          <w:top w:val="thinThickSmallGap" w:sz="24" w:space="1" w:color="auto"/>
-          <w:bottom w:val="thickThinSmallGap" w:sz="24" w:space="1" w:color="auto"/>
-        </w:pBdr>
-        <w:spacing w:before="120"/>
+        <w:spacing w:before="360" w:after="60"/>
         <w:jc w:val="center"/>
         <w:rPr>
           <w:rFonts w:cs="Times New Roman"/>

</xml_diff>

<commit_message>
Absendenbuch: Titel von Final und Standcup linksbuendig (1.68.15)
Ueber den schmalen, linksbuendigen Tabellen stehen «MSV Wilen Final» und
«Standcup» jetzt links (Einzug 80 Twips = Zellabstand), statt mittig.

Co-Authored-By: Claude Opus 5.5 (1M context) <noreply@anthropic.com>
</commit_message>
<xml_diff>
--- a/inc/absenden/dat/Resultatbuch_Template20261013.docx
+++ b/inc/absenden/dat/Resultatbuch_Template20261013.docx
@@ -17230,7 +17230,7 @@
     <w:p>
       <w:pPr>
         <w:spacing w:before="360" w:after="60"/>
-        <w:jc w:val="center"/>
+        <w:ind w:left="80"/>
         <w:rPr>
           <w:rFonts w:cs="Times New Roman"/>
           <w:b/>
@@ -17266,7 +17266,7 @@
     <w:p>
       <w:pPr>
         <w:spacing w:before="360" w:after="60"/>
-        <w:jc w:val="center"/>
+        <w:ind w:left="80"/>
         <w:rPr>
           <w:rFonts w:cs="Times New Roman"/>
           <w:b/>

</xml_diff>